<commit_message>
docs(ijmr): full declarations, supplementary figures moved to supplementary file, Arabic table numbering
- Added complete declarations block to blinded manuscript (ethics, consent,
  data availability, author contributions, AI use, acknowledgments, funding,
  conflicts) before references.
- Moved Supplementary Figures S1-S2 out of the figures document into the
  supplementary file (embedded there).
- Changed table numbering from Roman (I-V) to Arabic (1-5) in headers and in-text.
Rebuilt manuscript/figures/supplementary DOCX; refs still sequential, no orphans.

Co-Authored-By: Claude Opus 4.8 <noreply@anthropic.com>
</commit_message>
<xml_diff>
--- a/india-ageing-atlas/submission_assets/IJMR_HEALTH_ECONOMICS_ELDERLY_2026-06-26/figures_IJMR.docx
+++ b/india-ageing-atlas/submission_assets/IJMR_HEALTH_ECONOMICS_ELDERLY_2026-06-26/figures_IJMR.docx
@@ -2,7 +2,7 @@
 <file path=word/document.xml><?xml version="1.0" encoding="utf-8"?>
 <w:document xmlns:w="http://schemas.openxmlformats.org/wordprocessingml/2006/main" xmlns:m="http://schemas.openxmlformats.org/officeDocument/2006/math" xmlns:r="http://schemas.openxmlformats.org/officeDocument/2006/relationships" xmlns:o="urn:schemas-microsoft-com:office:office" xmlns:v="urn:schemas-microsoft-com:vml" xmlns:w10="urn:schemas-microsoft-com:office:word" xmlns:a="http://schemas.openxmlformats.org/drawingml/2006/main" xmlns:pic="http://schemas.openxmlformats.org/drawingml/2006/picture" xmlns:wp="http://schemas.openxmlformats.org/drawingml/2006/wordprocessingDrawing">
   <w:body>
-    <w:bookmarkStart w:id="33" w:name="figures"/>
+    <w:bookmarkStart w:id="27" w:name="figures"/>
     <w:p>
       <w:pPr>
         <w:pStyle w:val="Heading1"/>
@@ -458,159 +458,18 @@
       </w:r>
     </w:p>
     <w:p>
-      <w:r>
-        <w:pict>
-          <v:rect style="width:0;height:1.5pt" o:hralign="center" o:hrstd="t" o:hr="t"/>
-        </w:pict>
-      </w:r>
-    </w:p>
-    <w:p>
-      <w:pPr>
-        <w:pStyle w:val="FirstParagraph"/>
+      <w:pPr>
+        <w:pStyle w:val="BodyText"/>
       </w:pPr>
       <w:r>
         <w:rPr>
-          <w:b/>
-          <w:bCs/>
+          <w:i/>
+          <w:iCs/>
         </w:rPr>
-        <w:t xml:space="preserve">Supplementary Figure S1.</w:t>
-      </w:r>
-      <w:r>
-        <w:t xml:space="preserve"> </w:t>
-      </w:r>
-      <w:r>
-        <w:t xml:space="preserve">Concentration curve for catastrophic spending against cumulative population ranked by per-capita consumption.</w:t>
-      </w:r>
-    </w:p>
-    <w:p>
-      <w:pPr>
-        <w:pStyle w:val="CaptionedFigure"/>
-      </w:pPr>
-      <w:r>
-        <w:drawing>
-          <wp:inline>
-            <wp:extent cx="5334000" cy="4882728"/>
-            <wp:effectExtent b="0" l="0" r="0" t="0"/>
-            <wp:docPr descr="Supplementary Figure S1" title="" id="28" name="Picture"/>
-            <a:graphic>
-              <a:graphicData uri="http://schemas.openxmlformats.org/drawingml/2006/picture">
-                <pic:pic>
-                  <pic:nvPicPr>
-                    <pic:cNvPr descr="figures/Figure_S1.png" id="29" name="Picture"/>
-                    <pic:cNvPicPr>
-                      <a:picLocks noChangeArrowheads="1" noChangeAspect="1"/>
-                    </pic:cNvPicPr>
-                  </pic:nvPicPr>
-                  <pic:blipFill>
-                    <a:blip r:embed="rId27"/>
-                    <a:stretch>
-                      <a:fillRect/>
-                    </a:stretch>
-                  </pic:blipFill>
-                  <pic:spPr bwMode="auto">
-                    <a:xfrm>
-                      <a:off x="0" y="0"/>
-                      <a:ext cx="5334000" cy="4882728"/>
-                    </a:xfrm>
-                    <a:prstGeom prst="rect">
-                      <a:avLst/>
-                    </a:prstGeom>
-                    <a:noFill/>
-                    <a:ln w="9525">
-                      <a:noFill/>
-                      <a:headEnd/>
-                      <a:tailEnd/>
-                    </a:ln>
-                  </pic:spPr>
-                </pic:pic>
-              </a:graphicData>
-            </a:graphic>
-          </wp:inline>
-        </w:drawing>
-      </w:r>
-    </w:p>
-    <w:p>
-      <w:pPr>
-        <w:pStyle w:val="ImageCaption"/>
-      </w:pPr>
-      <w:r>
-        <w:t xml:space="preserve">Supplementary Figure S1</w:t>
-      </w:r>
-    </w:p>
-    <w:p>
-      <w:pPr>
-        <w:pStyle w:val="BodyText"/>
-      </w:pPr>
-      <w:r>
-        <w:rPr>
-          <w:b/>
-          <w:bCs/>
-        </w:rPr>
-        <w:t xml:space="preserve">Supplementary Figure S2.</w:t>
-      </w:r>
-      <w:r>
-        <w:t xml:space="preserve"> </w:t>
-      </w:r>
-      <w:r>
-        <w:t xml:space="preserve">The economic value of unpaid family caregiving for older adults.</w:t>
-      </w:r>
-    </w:p>
-    <w:p>
-      <w:pPr>
-        <w:pStyle w:val="CaptionedFigure"/>
-      </w:pPr>
-      <w:r>
-        <w:drawing>
-          <wp:inline>
-            <wp:extent cx="5334000" cy="4486632"/>
-            <wp:effectExtent b="0" l="0" r="0" t="0"/>
-            <wp:docPr descr="Supplementary Figure S2" title="" id="31" name="Picture"/>
-            <a:graphic>
-              <a:graphicData uri="http://schemas.openxmlformats.org/drawingml/2006/picture">
-                <pic:pic>
-                  <pic:nvPicPr>
-                    <pic:cNvPr descr="figures/Figure_S2.png" id="32" name="Picture"/>
-                    <pic:cNvPicPr>
-                      <a:picLocks noChangeArrowheads="1" noChangeAspect="1"/>
-                    </pic:cNvPicPr>
-                  </pic:nvPicPr>
-                  <pic:blipFill>
-                    <a:blip r:embed="rId30"/>
-                    <a:stretch>
-                      <a:fillRect/>
-                    </a:stretch>
-                  </pic:blipFill>
-                  <pic:spPr bwMode="auto">
-                    <a:xfrm>
-                      <a:off x="0" y="0"/>
-                      <a:ext cx="5334000" cy="4486632"/>
-                    </a:xfrm>
-                    <a:prstGeom prst="rect">
-                      <a:avLst/>
-                    </a:prstGeom>
-                    <a:noFill/>
-                    <a:ln w="9525">
-                      <a:noFill/>
-                      <a:headEnd/>
-                      <a:tailEnd/>
-                    </a:ln>
-                  </pic:spPr>
-                </pic:pic>
-              </a:graphicData>
-            </a:graphic>
-          </wp:inline>
-        </w:drawing>
-      </w:r>
-    </w:p>
-    <w:p>
-      <w:pPr>
-        <w:pStyle w:val="ImageCaption"/>
-      </w:pPr>
-      <w:r>
-        <w:t xml:space="preserve">Supplementary Figure S2</w:t>
-      </w:r>
-    </w:p>
-    <w:bookmarkEnd w:id="33"/>
+        <w:t xml:space="preserve">Supplementary Figures S1 and S2 are provided in the supplementary file.</w:t>
+      </w:r>
+    </w:p>
+    <w:bookmarkEnd w:id="27"/>
     <w:sectPr>
       <w:footnotePr>
         <w:numRestart w:val="eachSect"/>

</xml_diff>